<commit_message>
Update all resume variants with RAS validation detail and trimmed older roles
Rewrite the AMD section around actual PCIe AER / XGMI flit / DRAM ECC RAS
work and bring-up debugging, add grounded TDX/SGX detail to the Intel
post-silicon section, and trim IP Verification/MMS/NXP to their most
relevant detail. Applied consistently across us/my/tw/jp variants and
regenerated the ATS docx from the updated generator script.

Co-Authored-By: Claude Sonnet 5 <noreply@anthropic.com>
</commit_message>
<xml_diff>
--- a/ats/Muhammad_Zaim_Rusli_Resume.docx
+++ b/ats/Muhammad_Zaim_Rusli_Resume.docx
@@ -65,7 +65,7 @@
           <w:b w:val="0"/>
           <w:sz w:val="22"/>
         </w:rPr>
-        <w:t>Proven expertise in system-level validation, production readiness qualification, silicon bring-up, failure analysis, yield improvement, RMA debug, hardware-software-firmware integration and manufacturing test optimization. Experienced in developing automated validation infrastructures using Python and Shell scripting while driving complex cross-domain root cause analysis across silicon, firmware, BIOS, operating systems and platform hardware.</w:t>
+        <w:t>Proven expertise in system-level validation, production readiness qualification, silicon bring-up, failure analysis, yield improvement, debug, hardware-software-firmware integration and manufacturing test optimization. Experienced in developing automated validation scripts using Python and Shell scripting while driving cross-domain root cause analysis across silicon, firmware, BIOS, operating systems and platform hardware.</w:t>
       </w:r>
     </w:p>
     <w:p>
@@ -110,7 +110,7 @@
         <w:pStyle w:val="ListBullet"/>
       </w:pPr>
       <w:r>
-        <w:t>Developed and maintained automated test infrastructure for validation and production readiness programs.</w:t>
+        <w:t>Developed and maintained automated test scripts for validation and production readiness.</w:t>
       </w:r>
     </w:p>
     <w:p>
@@ -134,7 +134,7 @@
         <w:pStyle w:val="ListBullet"/>
       </w:pPr>
       <w:r>
-        <w:t>Strong background in server platform bring-up including CPU, memory, PCIe devices, NICs and BMC infrastructures.</w:t>
+        <w:t>Strong background in server platform bring-up including CPU, memory, PCIe devices, NICs and OpenBMC infrastructures.</w:t>
       </w:r>
     </w:p>
     <w:p>
@@ -142,7 +142,7 @@
         <w:pStyle w:val="ListBullet"/>
       </w:pPr>
       <w:r>
-        <w:t>Experience supporting release and manufacturing decisions based on validation readiness criteria.</w:t>
+        <w:t>Experience supporting release and manufacturing decisions based on validation readiness.</w:t>
       </w:r>
     </w:p>
     <w:p>
@@ -158,7 +158,7 @@
         <w:pStyle w:val="ListBullet"/>
       </w:pPr>
       <w:r>
-        <w:t>Experienced in System Level Test (SLT), Manufacturing Readiness, Production Qualification, Yield Improvement, Failure Correlation, Tester Correlation, Root Cause Analysis, RMA Analysis, Product Characterization, Performance Characterization, Platform Bring-up, Power Characterization and Automation Infrastructure development.</w:t>
+        <w:t>Experienced in SLT, Manufacturing Readiness, Production Qualification, Yield Improvement, Failure Correlation, Tester Correlation, Root Cause Analysis, Platform Bring-up.</w:t>
       </w:r>
     </w:p>
     <w:p>
@@ -179,7 +179,7 @@
           <w:b w:val="0"/>
           <w:sz w:val="22"/>
         </w:rPr>
-        <w:t>Architecture &amp; Platforms: AMD EPYC, Intel Xeon, x86 Architecture, Server Platforms, Datacenter Infrastructure, PCIe Gen4/Gen5, CXL, DDR4/DDR5, BIOS/UEFI, OpenBMC</w:t>
+        <w:t>Architecture &amp; Platforms: AMD EPYC, Intel Xeon, x86 Architecture, Server Platforms, Datacenter Infrastructure, PCIe Gen5/Gen6, DDR4/DDR5, BIOS/UEFI, OpenBMC</w:t>
       </w:r>
     </w:p>
     <w:p>
@@ -197,7 +197,7 @@
           <w:b w:val="0"/>
           <w:sz w:val="22"/>
         </w:rPr>
-        <w:t>Debug &amp; Diagnostics: Machine Check Exceptions (MCE), WHEA, BERT, Error Injection, Status Registers, Scan Dumps, dmesg, UART, BIOS Debug, Firmware Debug</w:t>
+        <w:t>Debug &amp; Diagnostics: Machine Check Exceptions (MCE), WHEA, BERT, Error Injection, Status Registers, Scan Dumps, dmesg, serial/UART console, SPI flash reprogramming, JTAG</w:t>
       </w:r>
     </w:p>
     <w:p>
@@ -206,7 +206,7 @@
           <w:b w:val="0"/>
           <w:sz w:val="22"/>
         </w:rPr>
-        <w:t>Tools: PRISM, HEXA, Git, JIRA, Simics, Verdi, DediProg, Linux, Windows</w:t>
+        <w:t>Tools: PRISM, HEXA, Git, JIRA, Confluence, Simics, Verdi, DediProg, Linux, Windows, Xilinx Vivado</w:t>
       </w:r>
     </w:p>
     <w:p>
@@ -243,7 +243,7 @@
         <w:pStyle w:val="ListBullet"/>
       </w:pPr>
       <w:r>
-        <w:t>Execute post-silicon functional validation and production readiness qualification activities on AMD EPYC server processors.</w:t>
+        <w:t>Bring up new AMD EPYC server platforms end-to-end from receipt of engineering systems, including HW installation (DIMM, CPU), troubleshooting (NIC, LAN, component), firmware flashing (BIOS, BMC, FPGA), OS provisioning and OpenBMC configuration, to establish a stable boot baseline ahead of RAS test execution.</w:t>
       </w:r>
     </w:p>
     <w:p>
@@ -251,7 +251,7 @@
         <w:pStyle w:val="ListBullet"/>
       </w:pPr>
       <w:r>
-        <w:t>Perform system-level validation across CPU, memory, PCIe and firmware subsystems under customer-representative workloads.</w:t>
+        <w:t>Triage platform bring-up failures on new silicon, isolating root cause across DIMM faults, CPLD corruption, outdated firmware recipes (BMC/BIOS/FPGA version mismatches), physically damaged components, leakage and device enumeration failures preventing system boot.</w:t>
       </w:r>
     </w:p>
     <w:p>
@@ -259,7 +259,7 @@
         <w:pStyle w:val="ListBullet"/>
       </w:pPr>
       <w:r>
-        <w:t>Conduct failure analysis using Machine Check Exceptions (MCE), WHEA Logger, BERT records and hardware status registers to identify silicon and platform root causes.</w:t>
+        <w:t>Validate RAS error detection, classification and recovery behavior for XGMI flit errors, PCIe AER (Correctable/Non-Fatal/Fatal) and DRAM ECC (single-bit/multi-bit) on server platforms.</w:t>
       </w:r>
     </w:p>
     <w:p>
@@ -267,7 +267,7 @@
         <w:pStyle w:val="ListBullet"/>
       </w:pPr>
       <w:r>
-        <w:t>Execute error injection, reliability testing and platform characterization to evaluate robustness of production silicon.</w:t>
+        <w:t>Analyze error logs and traces across dmesg, BERT, register dump, Sherlock, WinDbg and DebugView to confirm errors are correctly detected, logged and surfaced to the OS/firmware without being silently dropped or misclassified.</w:t>
       </w:r>
     </w:p>
     <w:p>
@@ -275,7 +275,7 @@
         <w:pStyle w:val="ListBullet"/>
       </w:pPr>
       <w:r>
-        <w:t>Support platform bring-up, hardware assembly, BIOS configuration, OpenBMC management, operating system provisioning and regression infrastructure maintenance.</w:t>
+        <w:t>Develop and maintain a pytest-based PCIe AER RAS validation suite covering correctable and uncorrectable (fatal/non-fatal) error types such as LCRC, ECRC and poisoned TLP, across OS-First and Firmware-First (SMI/MPRAS) reporting modes, with Downstream Port Containment on/off, using both ACPI EINJ and direct register-level (SMN) error injection.</w:t>
       </w:r>
     </w:p>
     <w:p>
@@ -283,7 +283,7 @@
         <w:pStyle w:val="ListBullet"/>
       </w:pPr>
       <w:r>
-        <w:t>Develop Python-based automation solutions within the PRISM validation framework to improve validation throughput and execution consistency.</w:t>
+        <w:t>Implement register-level PCI configuration space overrides (via setpci) to force root-port DPC and error-mask register state to match intended test conditions when BIOS defaults diverged, restoring original state after each test.</w:t>
       </w:r>
     </w:p>
     <w:p>
@@ -291,7 +291,23 @@
         <w:pStyle w:val="ListBullet"/>
       </w:pPr>
       <w:r>
-        <w:t>Work cross-functionally with architecture, firmware, BIOS and platform engineering teams to resolve complex system-level issues and improve validation coverage.</w:t>
+        <w:t>Leverage AI coding assistants (Claude) to accelerate development and maintenance of Python-based RAS validation scripts, freeing up engineering time for validation, debug and silicon root-cause analysis.</w:t>
+      </w:r>
+    </w:p>
+    <w:p>
+      <w:pPr>
+        <w:pStyle w:val="ListBullet"/>
+      </w:pPr>
+      <w:r>
+        <w:t>Own regression across platform configurations against evolving FW builds within the PRISM framework, triaging failures to root cause across script, framework, platform or silicon.</w:t>
+      </w:r>
+    </w:p>
+    <w:p>
+      <w:pPr>
+        <w:pStyle w:val="ListBullet"/>
+      </w:pPr>
+      <w:r>
+        <w:t>Collaborate cross-functionally with architecture, firmware, BIOS and HW teams to close out complex system-level RAS issues and improve validation coverage, tracking issues in Jira and maintaining debug/validation documentation in Confluence.</w:t>
       </w:r>
     </w:p>
     <w:p>
@@ -325,15 +341,7 @@
         <w:pStyle w:val="ListBullet"/>
       </w:pPr>
       <w:r>
-        <w:t>Executed structured test plans, silicon qualification activities and manufacturing readiness validation on Intel Xeon server processors.</w:t>
-      </w:r>
-    </w:p>
-    <w:p>
-      <w:pPr>
-        <w:pStyle w:val="ListBullet"/>
-      </w:pPr>
-      <w:r>
-        <w:t>Defined system-level validation methodologies supporting production release decisions for complex server SoCs.</w:t>
+        <w:t>Improved and executed structured test plans and silicon qualification activities on the Intel Xeon server platform, defining system-level validation methodologies that directly supported production release decisions.</w:t>
       </w:r>
     </w:p>
     <w:p>
@@ -349,7 +357,7 @@
         <w:pStyle w:val="ListBullet"/>
       </w:pPr>
       <w:r>
-        <w:t>Conducted extensive stress, corner-case and concurrency testing to characterize silicon quality, reliability and scalability under production-like conditions.</w:t>
+        <w:t>Validated ACM authentication and SEAM Loader boot/initialization flows for TDX, confirming correct TDX module measurement and loading across BIOS and microcode updates.</w:t>
       </w:r>
     </w:p>
     <w:p>
@@ -357,7 +365,7 @@
         <w:pStyle w:val="ListBullet"/>
       </w:pPr>
       <w:r>
-        <w:t>Performed root cause analysis across hardware, BIOS, firmware and operating system layers to resolve manufacturing-blocking and customer-impacting issues.</w:t>
+        <w:t>Validated SGX and TDX attestation flows, confirming enclave/TD quotes correctly reflect genuine platform and measurement state.</w:t>
       </w:r>
     </w:p>
     <w:p>
@@ -365,7 +373,7 @@
         <w:pStyle w:val="ListBullet"/>
       </w:pPr>
       <w:r>
-        <w:t>Validated security, trusted execution and platform initialization features including TDX, SGX, ACM and SEAM Loader integration.</w:t>
+        <w:t>Validated concurrency and stress testing involving hundreds of simultaneous enclaves/Trust Domains to characterize silicon reliability and validate isolation integrity under production-like load.</w:t>
       </w:r>
     </w:p>
     <w:p>
@@ -373,23 +381,7 @@
         <w:pStyle w:val="ListBullet"/>
       </w:pPr>
       <w:r>
-        <w:t>Executed large-scale concurrency testing involving hundreds of simultaneous workloads to validate platform stability and memory resource management.</w:t>
-      </w:r>
-    </w:p>
-    <w:p>
-      <w:pPr>
-        <w:pStyle w:val="ListBullet"/>
-      </w:pPr>
-      <w:r>
-        <w:t>Collaborated with architecture teams to drive silicon defect identification, debug and closure.</w:t>
-      </w:r>
-    </w:p>
-    <w:p>
-      <w:pPr>
-        <w:pStyle w:val="ListBullet"/>
-      </w:pPr>
-      <w:r>
-        <w:t>Supported manufacturing release criteria through objective silicon validation metrics and readiness assessments.</w:t>
+        <w:t>Performed root cause analysis across hardware, BIOS, firmware and OS layers, collaborating with architecture teams to resolve manufacturing-blocking and customer-impacting silicon defects.</w:t>
       </w:r>
     </w:p>
     <w:p>
@@ -406,7 +398,7 @@
         <w:pStyle w:val="ListBullet"/>
       </w:pPr>
       <w:r>
-        <w:t>Executed SoC functional validation in Simics Virtual Platform and FPGA emulation environments.</w:t>
+        <w:t>Responsible for SoC functional validation of Intel Xeon server processors in Simics Virtual Platform and FPGA emulation environments ahead of silicon availability.</w:t>
       </w:r>
     </w:p>
     <w:p>
@@ -414,7 +406,7 @@
         <w:pStyle w:val="ListBullet"/>
       </w:pPr>
       <w:r>
-        <w:t>Developed automation to validate boot flows, feature enablement and register-level functionality.</w:t>
+        <w:t>Developed JSON-configurable automation to drive boot sequences and verify TDX/SGX-related register state against specification, enabling fast scenario experimentation without code changes.</w:t>
       </w:r>
     </w:p>
     <w:p>
@@ -422,7 +414,7 @@
         <w:pStyle w:val="ListBullet"/>
       </w:pPr>
       <w:r>
-        <w:t>Validated security and trusted execution features prior to silicon availability, reducing downstream silicon debug effort.</w:t>
+        <w:t>Debugged cases where expected registers failed to reach their specified state, tracing root cause across initialization ordering and distinguishing genuine design issues from virtual-platform model limitations.</w:t>
       </w:r>
     </w:p>
     <w:p>
@@ -439,15 +431,7 @@
         <w:pStyle w:val="ListBullet"/>
       </w:pPr>
       <w:r>
-        <w:t>Performed system-level validation on embedded and client platform SoCs.</w:t>
-      </w:r>
-    </w:p>
-    <w:p>
-      <w:pPr>
-        <w:pStyle w:val="ListBullet"/>
-      </w:pPr>
-      <w:r>
-        <w:t>Developed automation supporting boot verification and platform readiness checks.</w:t>
+        <w:t>Performed functional validation on client/laptop platform SoCs using Simics Virtual Platform, developing automation (legacy in-house framework) to drive the full flow from system boot through BIOS configuration changes to device/register verification on the system under test.</w:t>
       </w:r>
     </w:p>
     <w:p>
@@ -480,7 +464,7 @@
         <w:pStyle w:val="ListBullet"/>
       </w:pPr>
       <w:r>
-        <w:t>Verified R-Link Soft IP functionality using SystemVerilog and UVM methodologies.</w:t>
+        <w:t>Verified a soft IP block's functionality using SystemVerilog/UVM, improving and extending constrained-random test scenarios that uncovered handshake failures and timing-window violations in signal insertion, broadening test coverage to catch them.</w:t>
       </w:r>
     </w:p>
     <w:p>
@@ -488,7 +472,7 @@
         <w:pStyle w:val="ListBullet"/>
       </w:pPr>
       <w:r>
-        <w:t>Developed constrained-random test scenarios to improve feature coverage and RTL bug detection.</w:t>
+        <w:t>Performed waveform-level root cause analysis using Verdi to debug the protocol and timing issues identified during verification.</w:t>
       </w:r>
     </w:p>
     <w:p>
@@ -496,23 +480,7 @@
         <w:pStyle w:val="ListBullet"/>
       </w:pPr>
       <w:r>
-        <w:t>Performed waveform analysis and root cause investigation using Verdi simulation tools.</w:t>
-      </w:r>
-    </w:p>
-    <w:p>
-      <w:pPr>
-        <w:pStyle w:val="ListBullet"/>
-      </w:pPr>
-      <w:r>
-        <w:t>Developed assertions and coverage metrics supporting verification closure objectives.</w:t>
-      </w:r>
-    </w:p>
-    <w:p>
-      <w:pPr>
-        <w:pStyle w:val="ListBullet"/>
-      </w:pPr>
-      <w:r>
-        <w:t>Collaborated closely with RTL design teams to resolve protocol and integration issues prior to tape-out.</w:t>
+        <w:t>Collaborated with RTL design and architecture teams to resolve protocol and integration issues or limitations ahead of release.</w:t>
       </w:r>
     </w:p>
     <w:p>
@@ -525,7 +493,7 @@
         <w:rPr>
           <w:b/>
         </w:rPr>
-        <w:t>Test and Product Engineer — Malaysia Microelectronic Solutions (MMS), Selangor, Malaysia</w:t>
+        <w:t>Test and Product Engineer — Malaysia Microelectronic Solutions (MyMS), Selangor, Malaysia</w:t>
       </w:r>
       <w:r>
         <w:tab/>
@@ -537,7 +505,7 @@
         <w:pStyle w:val="ListBullet"/>
       </w:pPr>
       <w:r>
-        <w:t>Developed and debugged production ATE test programs supporting semiconductor high-volume manufacturing.</w:t>
+        <w:t>Developed and debugged ATE test programs on Credence Kalos testers for production IC test, including a smart card (payphone card) product for an overseas telecom customer.</w:t>
       </w:r>
     </w:p>
     <w:p>
@@ -545,23 +513,7 @@
         <w:pStyle w:val="ListBullet"/>
       </w:pPr>
       <w:r>
-        <w:t>Performed yield analysis, electrical characterization and probe-level failure debug.</w:t>
-      </w:r>
-    </w:p>
-    <w:p>
-      <w:pPr>
-        <w:pStyle w:val="ListBullet"/>
-      </w:pPr>
-      <w:r>
-        <w:t>Supported manufacturing test optimization and production release readiness.</w:t>
-      </w:r>
-    </w:p>
-    <w:p>
-      <w:pPr>
-        <w:pStyle w:val="ListBullet"/>
-      </w:pPr>
-      <w:r>
-        <w:t>Collaborated with external organizations to resolve hardware and probe-related production issues.</w:t>
+        <w:t>Performed wafer probing on an Electroglas EG4090µ wafer prober loaned from MIMOS, diagnosing probe-related hardware issues including prober die-indexing/mapping mismatches and resolving them in coordination with MIMOS, while supporting yield analysis and electrical characterization for production release readiness.</w:t>
       </w:r>
     </w:p>
     <w:p>
@@ -586,7 +538,7 @@
         <w:pStyle w:val="ListBullet"/>
       </w:pPr>
       <w:r>
-        <w:t>Developed Teradyne J750 production test solutions.</w:t>
+        <w:t>Enhanced Teradyne J750 production test programs for automotive MCU devices as part of the NVM (non-volatile memory) test team.</w:t>
       </w:r>
     </w:p>
     <w:p>
@@ -594,23 +546,7 @@
         <w:pStyle w:val="ListBullet"/>
       </w:pPr>
       <w:r>
-        <w:t>Performed device characterization, failure analysis and tester correlation activities.</w:t>
-      </w:r>
-    </w:p>
-    <w:p>
-      <w:pPr>
-        <w:pStyle w:val="ListBullet"/>
-      </w:pPr>
-      <w:r>
-        <w:t>Supported production qualification and yield improvement initiatives.</w:t>
-      </w:r>
-    </w:p>
-    <w:p>
-      <w:pPr>
-        <w:pStyle w:val="ListBullet"/>
-      </w:pPr>
-      <w:r>
-        <w:t>Maintained automation scripts supporting manufacturing and characterization activities.</w:t>
+        <w:t>Performed device characterization and tester-to-golden-unit correlation to validate test accuracy, supporting failure analysis, yield improvement and production qualification.</w:t>
       </w:r>
     </w:p>
     <w:p>

</xml_diff>